<commit_message>
publish: sync from 正本 2026-08-17T14:53:57Z
</commit_message>
<xml_diff>
--- a/plugins/osi-finance/docs/OSI-Finance-運用手順書.docx
+++ b/plugins/osi-finance/docs/OSI-Finance-運用手順書.docx
@@ -203,7 +203,48 @@
           <w:sz w:val="23"/>
           <w:szCs w:val="23"/>
         </w:rPr>
-        <w:t xml:space="preserve">自動で走るもの（人は何もしなくてよい）</w:t>
+        <w:t xml:space="preserve">自動で走るもの（設定すれば人は何もしなくてよい）</w:t>
+      </w:r>
+    </w:p>
+    <w:p>
+      <w:pPr>
+        <w:spacing w:after="100" w:line="300"/>
+      </w:pPr>
+      <w:r>
+        <w:rPr>
+          <w:rFonts w:ascii="Yu Gothic" w:cs="Yu Gothic" w:eastAsia="Yu Gothic" w:hAnsi="Yu Gothic"/>
+          <w:b/>
+          <w:bCs/>
+          <w:sz w:val="21"/>
+          <w:szCs w:val="21"/>
+        </w:rPr>
+        <w:t xml:space="preserve">⚠ この7本は、最初は動いていません。</w:t>
+      </w:r>
+      <w:r>
+        <w:rPr>
+          <w:rFonts w:ascii="Yu Gothic" w:cs="Yu Gothic" w:eastAsia="Yu Gothic" w:hAnsi="Yu Gothic"/>
+          <w:sz w:val="21"/>
+          <w:szCs w:val="21"/>
+        </w:rPr>
+        <w:t xml:space="preserve">自動実行はアプリに元から入っているものではなく、</w:t>
+      </w:r>
+      <w:r>
+        <w:rPr>
+          <w:rFonts w:ascii="Yu Gothic" w:cs="Yu Gothic" w:eastAsia="Yu Gothic" w:hAnsi="Yu Gothic"/>
+          <w:b/>
+          <w:bCs/>
+          <w:sz w:val="21"/>
+          <w:szCs w:val="21"/>
+        </w:rPr>
+        <w:t xml:space="preserve">このパソコンごとに1回設定するもの</w:t>
+      </w:r>
+      <w:r>
+        <w:rPr>
+          <w:rFonts w:ascii="Yu Gothic" w:cs="Yu Gothic" w:eastAsia="Yu Gothic" w:hAnsi="Yu Gothic"/>
+          <w:sz w:val="21"/>
+          <w:szCs w:val="21"/>
+        </w:rPr>
+        <w:t xml:space="preserve">です。設定のしかたは第8章（手順13）にあります。</w:t>
       </w:r>
     </w:p>
     <w:p>
@@ -216,7 +257,7 @@
           <w:sz w:val="21"/>
           <w:szCs w:val="21"/>
         </w:rPr>
-        <w:t xml:space="preserve">下の時刻に自動で動き、結果をチャットに報告します。いずれも報告までで、台帳への確定書き込みと送金はしません。</w:t>
+        <w:t xml:space="preserve">設定すると下の時刻に自動で動き、結果をチャットに報告します。いずれも報告までで、台帳への確定書き込みと送金はしません。時刻は変えられます（第8章）。</w:t>
       </w:r>
     </w:p>
     <w:tbl>
@@ -263,7 +304,7 @@
                 <w:sz w:val="19"/>
                 <w:szCs w:val="19"/>
               </w:rPr>
-              <w:t xml:space="preserve">時刻</w:t>
+              <w:t xml:space="preserve">時刻（既定）</w:t>
             </w:r>
           </w:p>
         </w:tc>
@@ -370,7 +411,7 @@
                 <w:sz w:val="19"/>
                 <w:szCs w:val="19"/>
               </w:rPr>
-              <w:t xml:space="preserve">請求書の発行状況とGmailの送信済みを見て、台帳のステータスとの差分を報告</w:t>
+              <w:t xml:space="preserve">請求書を送ったかメールで確認して、台帳のステータスとの差を報告</w:t>
             </w:r>
           </w:p>
         </w:tc>
@@ -394,7 +435,7 @@
                 <w:sz w:val="19"/>
                 <w:szCs w:val="19"/>
               </w:rPr>
-              <w:t xml:space="preserve">差分があれば画面で状態を直す</w:t>
+              <w:t xml:space="preserve">差があれば画面で状態を直す</w:t>
             </w:r>
           </w:p>
         </w:tc>
@@ -447,7 +488,7 @@
                 <w:sz w:val="19"/>
                 <w:szCs w:val="19"/>
               </w:rPr>
-              <w:t xml:space="preserve">新しく締結された業務委託契約をメールから検出し、起票案を作る</w:t>
+              <w:t xml:space="preserve">メールに届いた新しい契約を見つけて、台帳に載せる案を作る</w:t>
             </w:r>
           </w:p>
         </w:tc>
@@ -524,7 +565,7 @@
                 <w:sz w:val="19"/>
                 <w:szCs w:val="19"/>
               </w:rPr>
-              <w:t xml:space="preserve">新着の受領請求書（振込払い）を検出し、未起票分を報告</w:t>
+              <w:t xml:space="preserve">メールやフォルダに届いた請求書を見つけて、支払予定に載せる案を作る</w:t>
             </w:r>
           </w:p>
         </w:tc>
@@ -601,7 +642,7 @@
                 <w:sz w:val="19"/>
                 <w:szCs w:val="19"/>
               </w:rPr>
-              <w:t xml:space="preserve">請求日が来た未請求分の請求書を発行し、PDFを格納してGmail下書きを作る</w:t>
+              <w:t xml:space="preserve">今月分の請求書を作って、送る前の下書きまで用意する</w:t>
             </w:r>
           </w:p>
         </w:tc>
@@ -678,7 +719,7 @@
                 <w:sz w:val="19"/>
                 <w:szCs w:val="19"/>
               </w:rPr>
-              <w:t xml:space="preserve">前月の売上計上漏れを会計側で検出して提示</w:t>
+              <w:t xml:space="preserve">先月の売上が会計に入っているか確かめる</w:t>
             </w:r>
           </w:p>
         </w:tc>
@@ -755,7 +796,7 @@
                 <w:sz w:val="19"/>
                 <w:szCs w:val="19"/>
               </w:rPr>
-              <w:t xml:space="preserve">前月分の月次クローズを実施し、差分と要対応点を報告</w:t>
+              <w:t xml:space="preserve">先月の帳簿を締めて、会計とのズレを洗い出す</w:t>
             </w:r>
           </w:p>
         </w:tc>
@@ -832,7 +873,7 @@
                 <w:sz w:val="19"/>
                 <w:szCs w:val="19"/>
               </w:rPr>
-              <w:t xml:space="preserve">当月末に支払予定の受領請求書を抽出し、振込リストとして報告</w:t>
+              <w:t xml:space="preserve">月末に払うものを一覧にする</w:t>
             </w:r>
           </w:p>
         </w:tc>
@@ -1971,7 +2012,7 @@
                 <w:sz w:val="19"/>
                 <w:szCs w:val="19"/>
               </w:rPr>
-              <w:t xml:space="preserve">4章</w:t>
+              <w:t xml:space="preserve">5章</w:t>
             </w:r>
           </w:p>
         </w:tc>
@@ -2024,6 +2065,237 @@
                 <w:sz w:val="19"/>
                 <w:szCs w:val="19"/>
               </w:rPr>
+              <w:t xml:space="preserve">自動実行を設定したい・時刻を変えたい</w:t>
+            </w:r>
+          </w:p>
+        </w:tc>
+        <w:tc>
+          <w:tcPr>
+            <w:tcW w:type="dxa" w:w="2100"/>
+            <w:tcMar>
+              <w:top w:type="dxa" w:w="60"/>
+              <w:left w:type="dxa" w:w="100"/>
+              <w:bottom w:type="dxa" w:w="60"/>
+              <w:right w:type="dxa" w:w="100"/>
+            </w:tcMar>
+          </w:tcPr>
+          <w:p>
+            <w:pPr>
+              <w:spacing w:after="0" w:line="280"/>
+            </w:pPr>
+            <w:r>
+              <w:rPr>
+                <w:rFonts w:ascii="Yu Gothic" w:cs="Yu Gothic" w:eastAsia="Yu Gothic" w:hAnsi="Yu Gothic"/>
+                <w:sz w:val="19"/>
+                <w:szCs w:val="19"/>
+              </w:rPr>
+              <w:t xml:space="preserve">手順13</w:t>
+            </w:r>
+          </w:p>
+        </w:tc>
+        <w:tc>
+          <w:tcPr>
+            <w:tcW w:type="dxa" w:w="2638"/>
+            <w:tcMar>
+              <w:top w:type="dxa" w:w="60"/>
+              <w:left w:type="dxa" w:w="100"/>
+              <w:bottom w:type="dxa" w:w="60"/>
+              <w:right w:type="dxa" w:w="100"/>
+            </w:tcMar>
+          </w:tcPr>
+          <w:p>
+            <w:pPr>
+              <w:spacing w:after="0" w:line="280"/>
+            </w:pPr>
+            <w:r>
+              <w:rPr>
+                <w:rFonts w:ascii="Yu Gothic" w:cs="Yu Gothic" w:eastAsia="Yu Gothic" w:hAnsi="Yu Gothic"/>
+                <w:sz w:val="19"/>
+                <w:szCs w:val="19"/>
+              </w:rPr>
+              <w:t xml:space="preserve">自動実行</w:t>
+            </w:r>
+          </w:p>
+        </w:tc>
+      </w:tr>
+      <w:tr>
+        <w:trPr>
+          <w:tblHeader w:val="false"/>
+        </w:trPr>
+        <w:tc>
+          <w:tcPr>
+            <w:tcW w:type="dxa" w:w="4900"/>
+            <w:tcMar>
+              <w:top w:type="dxa" w:w="60"/>
+              <w:left w:type="dxa" w:w="100"/>
+              <w:bottom w:type="dxa" w:w="60"/>
+              <w:right w:type="dxa" w:w="100"/>
+            </w:tcMar>
+          </w:tcPr>
+          <w:p>
+            <w:pPr>
+              <w:spacing w:after="0" w:line="280"/>
+            </w:pPr>
+            <w:r>
+              <w:rPr>
+                <w:rFonts w:ascii="Yu Gothic" w:cs="Yu Gothic" w:eastAsia="Yu Gothic" w:hAnsi="Yu Gothic"/>
+                <w:sz w:val="19"/>
+                <w:szCs w:val="19"/>
+              </w:rPr>
+              <w:t xml:space="preserve">自動実行が動いているか不安</w:t>
+            </w:r>
+          </w:p>
+        </w:tc>
+        <w:tc>
+          <w:tcPr>
+            <w:tcW w:type="dxa" w:w="2100"/>
+            <w:tcMar>
+              <w:top w:type="dxa" w:w="60"/>
+              <w:left w:type="dxa" w:w="100"/>
+              <w:bottom w:type="dxa" w:w="60"/>
+              <w:right w:type="dxa" w:w="100"/>
+            </w:tcMar>
+          </w:tcPr>
+          <w:p>
+            <w:pPr>
+              <w:spacing w:after="0" w:line="280"/>
+            </w:pPr>
+            <w:r>
+              <w:rPr>
+                <w:rFonts w:ascii="Yu Gothic" w:cs="Yu Gothic" w:eastAsia="Yu Gothic" w:hAnsi="Yu Gothic"/>
+                <w:sz w:val="19"/>
+                <w:szCs w:val="19"/>
+              </w:rPr>
+              <w:t xml:space="preserve">手順14</w:t>
+            </w:r>
+          </w:p>
+        </w:tc>
+        <w:tc>
+          <w:tcPr>
+            <w:tcW w:type="dxa" w:w="2638"/>
+            <w:tcMar>
+              <w:top w:type="dxa" w:w="60"/>
+              <w:left w:type="dxa" w:w="100"/>
+              <w:bottom w:type="dxa" w:w="60"/>
+              <w:right w:type="dxa" w:w="100"/>
+            </w:tcMar>
+          </w:tcPr>
+          <w:p>
+            <w:pPr>
+              <w:spacing w:after="0" w:line="280"/>
+            </w:pPr>
+            <w:r>
+              <w:rPr>
+                <w:rFonts w:ascii="Yu Gothic" w:cs="Yu Gothic" w:eastAsia="Yu Gothic" w:hAnsi="Yu Gothic"/>
+                <w:sz w:val="19"/>
+                <w:szCs w:val="19"/>
+              </w:rPr>
+              <w:t xml:space="preserve">自動実行</w:t>
+            </w:r>
+          </w:p>
+        </w:tc>
+      </w:tr>
+      <w:tr>
+        <w:trPr>
+          <w:tblHeader w:val="false"/>
+        </w:trPr>
+        <w:tc>
+          <w:tcPr>
+            <w:tcW w:type="dxa" w:w="4900"/>
+            <w:tcMar>
+              <w:top w:type="dxa" w:w="60"/>
+              <w:left w:type="dxa" w:w="100"/>
+              <w:bottom w:type="dxa" w:w="60"/>
+              <w:right w:type="dxa" w:w="100"/>
+            </w:tcMar>
+          </w:tcPr>
+          <w:p>
+            <w:pPr>
+              <w:spacing w:after="0" w:line="280"/>
+            </w:pPr>
+            <w:r>
+              <w:rPr>
+                <w:rFonts w:ascii="Yu Gothic" w:cs="Yu Gothic" w:eastAsia="Yu Gothic" w:hAnsi="Yu Gothic"/>
+                <w:sz w:val="19"/>
+                <w:szCs w:val="19"/>
+              </w:rPr>
+              <w:t xml:space="preserve">時刻を待たずに今すぐ動かしたい</w:t>
+            </w:r>
+          </w:p>
+        </w:tc>
+        <w:tc>
+          <w:tcPr>
+            <w:tcW w:type="dxa" w:w="2100"/>
+            <w:tcMar>
+              <w:top w:type="dxa" w:w="60"/>
+              <w:left w:type="dxa" w:w="100"/>
+              <w:bottom w:type="dxa" w:w="60"/>
+              <w:right w:type="dxa" w:w="100"/>
+            </w:tcMar>
+          </w:tcPr>
+          <w:p>
+            <w:pPr>
+              <w:spacing w:after="0" w:line="280"/>
+            </w:pPr>
+            <w:r>
+              <w:rPr>
+                <w:rFonts w:ascii="Yu Gothic" w:cs="Yu Gothic" w:eastAsia="Yu Gothic" w:hAnsi="Yu Gothic"/>
+                <w:sz w:val="19"/>
+                <w:szCs w:val="19"/>
+              </w:rPr>
+              <w:t xml:space="preserve">手順15</w:t>
+            </w:r>
+          </w:p>
+        </w:tc>
+        <w:tc>
+          <w:tcPr>
+            <w:tcW w:type="dxa" w:w="2638"/>
+            <w:tcMar>
+              <w:top w:type="dxa" w:w="60"/>
+              <w:left w:type="dxa" w:w="100"/>
+              <w:bottom w:type="dxa" w:w="60"/>
+              <w:right w:type="dxa" w:w="100"/>
+            </w:tcMar>
+          </w:tcPr>
+          <w:p>
+            <w:pPr>
+              <w:spacing w:after="0" w:line="280"/>
+            </w:pPr>
+            <w:r>
+              <w:rPr>
+                <w:rFonts w:ascii="Yu Gothic" w:cs="Yu Gothic" w:eastAsia="Yu Gothic" w:hAnsi="Yu Gothic"/>
+                <w:sz w:val="19"/>
+                <w:szCs w:val="19"/>
+              </w:rPr>
+              <w:t xml:space="preserve">自動実行</w:t>
+            </w:r>
+          </w:p>
+        </w:tc>
+      </w:tr>
+      <w:tr>
+        <w:trPr>
+          <w:tblHeader w:val="false"/>
+        </w:trPr>
+        <w:tc>
+          <w:tcPr>
+            <w:tcW w:type="dxa" w:w="4900"/>
+            <w:tcMar>
+              <w:top w:type="dxa" w:w="60"/>
+              <w:left w:type="dxa" w:w="100"/>
+              <w:bottom w:type="dxa" w:w="60"/>
+              <w:right w:type="dxa" w:w="100"/>
+            </w:tcMar>
+          </w:tcPr>
+          <w:p>
+            <w:pPr>
+              <w:spacing w:after="0" w:line="280"/>
+            </w:pPr>
+            <w:r>
+              <w:rPr>
+                <w:rFonts w:ascii="Yu Gothic" w:cs="Yu Gothic" w:eastAsia="Yu Gothic" w:hAnsi="Yu Gothic"/>
+                <w:sz w:val="19"/>
+                <w:szCs w:val="19"/>
+              </w:rPr>
               <w:t xml:space="preserve">画面がおかしい・数字が合わない</w:t>
             </w:r>
           </w:p>
@@ -2048,7 +2320,7 @@
                 <w:sz w:val="19"/>
                 <w:szCs w:val="19"/>
               </w:rPr>
-              <w:t xml:space="preserve">5章</w:t>
+              <w:t xml:space="preserve">6章</w:t>
             </w:r>
           </w:p>
         </w:tc>
@@ -2079,14 +2351,10 @@
       </w:tr>
     </w:tbl>
     <w:p>
-      <w:r>
-        <w:br w:type="page"/>
-      </w:r>
-    </w:p>
-    <w:p>
       <w:pPr>
         <w:pStyle w:val="Heading1"/>
-        <w:spacing w:after="140" w:before="320"/>
+        <w:pageBreakBefore/>
+        <w:spacing w:after="140" w:before="0"/>
       </w:pPr>
       <w:r>
         <w:rPr>
@@ -3319,14 +3587,10 @@
       </w:r>
     </w:p>
     <w:p>
-      <w:r>
-        <w:br w:type="page"/>
-      </w:r>
-    </w:p>
-    <w:p>
       <w:pPr>
         <w:pStyle w:val="Heading1"/>
-        <w:spacing w:after="140" w:before="320"/>
+        <w:pageBreakBefore/>
+        <w:spacing w:after="140" w:before="0"/>
       </w:pPr>
       <w:r>
         <w:rPr>
@@ -5171,14 +5435,10 @@
       </w:r>
     </w:p>
     <w:p>
-      <w:r>
-        <w:br w:type="page"/>
-      </w:r>
-    </w:p>
-    <w:p>
       <w:pPr>
         <w:pStyle w:val="Heading1"/>
-        <w:spacing w:after="140" w:before="320"/>
+        <w:pageBreakBefore/>
+        <w:spacing w:after="140" w:before="0"/>
       </w:pPr>
       <w:r>
         <w:rPr>
@@ -7053,14 +7313,10 @@
       </w:r>
     </w:p>
     <w:p>
-      <w:r>
-        <w:br w:type="page"/>
-      </w:r>
-    </w:p>
-    <w:p>
       <w:pPr>
         <w:pStyle w:val="Heading1"/>
-        <w:spacing w:after="140" w:before="320"/>
+        <w:pageBreakBefore/>
+        <w:spacing w:after="140" w:before="0"/>
       </w:pPr>
       <w:r>
         <w:rPr>
@@ -7070,7 +7326,1691 @@
           <w:sz w:val="28"/>
           <w:szCs w:val="28"/>
         </w:rPr>
-        <w:t xml:space="preserve">4. 要確認事項に出た項目の対処</w:t>
+        <w:t xml:space="preserve">4. 自動実行の設定</w:t>
+      </w:r>
+    </w:p>
+    <w:p>
+      <w:pPr>
+        <w:spacing w:after="120" w:line="300"/>
+      </w:pPr>
+      <w:r>
+        <w:rPr>
+          <w:rFonts w:ascii="Yu Gothic" w:cs="Yu Gothic" w:eastAsia="Yu Gothic" w:hAnsi="Yu Gothic"/>
+          <w:sz w:val="21"/>
+          <w:szCs w:val="21"/>
+        </w:rPr>
+        <w:t xml:space="preserve">サイドバーの「⏰ 自動実行」を開きます。ここは、上の7本を「いつ走らせるか」決める画面です。</w:t>
+      </w:r>
+    </w:p>
+    <w:p>
+      <w:pPr>
+        <w:spacing w:after="140" w:line="300"/>
+      </w:pPr>
+      <w:r>
+        <w:rPr>
+          <w:rFonts w:ascii="Yu Gothic" w:cs="Yu Gothic" w:eastAsia="Yu Gothic" w:hAnsi="Yu Gothic"/>
+          <w:b/>
+          <w:bCs/>
+          <w:sz w:val="21"/>
+          <w:szCs w:val="21"/>
+        </w:rPr>
+        <w:t xml:space="preserve">この画面が直接設定するのではありません。</w:t>
+      </w:r>
+      <w:r>
+        <w:rPr>
+          <w:rFonts w:ascii="Yu Gothic" w:cs="Yu Gothic" w:eastAsia="Yu Gothic" w:hAnsi="Yu Gothic"/>
+          <w:sz w:val="21"/>
+          <w:szCs w:val="21"/>
+        </w:rPr>
+        <w:t xml:space="preserve">ボタンを押すと Cowork が開いて指示文が入るので、内容を確認して送信してください。</w:t>
+      </w:r>
+    </w:p>
+    <w:p>
+      <w:pPr>
+        <w:pStyle w:val="Heading2"/>
+        <w:spacing w:after="80" w:before="280"/>
+      </w:pPr>
+      <w:r>
+        <w:rPr>
+          <w:rFonts w:ascii="Yu Gothic" w:cs="Yu Gothic" w:eastAsia="Yu Gothic" w:hAnsi="Yu Gothic"/>
+          <w:b/>
+          <w:bCs/>
+          <w:sz w:val="24"/>
+          <w:szCs w:val="24"/>
+        </w:rPr>
+        <w:t xml:space="preserve">手順13　はじめて設定する／時刻を変える</w:t>
+      </w:r>
+    </w:p>
+    <w:tbl>
+      <w:tblPr>
+        <w:tblW w:type="dxa" w:w="9638"/>
+        <w:tblBorders>
+          <w:top w:val="single" w:color="auto" w:sz="4"/>
+          <w:left w:val="single" w:color="auto" w:sz="4"/>
+          <w:bottom w:val="single" w:color="auto" w:sz="4"/>
+          <w:right w:val="single" w:color="auto" w:sz="4"/>
+          <w:insideH w:val="single" w:color="auto" w:sz="4"/>
+          <w:insideV w:val="single" w:color="auto" w:sz="4"/>
+        </w:tblBorders>
+      </w:tblPr>
+      <w:tblGrid>
+        <w:gridCol w:w="1500"/>
+        <w:gridCol w:w="8138"/>
+      </w:tblGrid>
+      <w:tr>
+        <w:trPr>
+          <w:tblHeader w:val="false"/>
+        </w:trPr>
+        <w:tc>
+          <w:tcPr>
+            <w:tcW w:type="dxa" w:w="1500"/>
+            <w:tcMar>
+              <w:top w:type="dxa" w:w="60"/>
+              <w:left w:type="dxa" w:w="100"/>
+              <w:bottom w:type="dxa" w:w="60"/>
+              <w:right w:type="dxa" w:w="100"/>
+            </w:tcMar>
+          </w:tcPr>
+          <w:p>
+            <w:pPr>
+              <w:spacing w:after="0" w:line="280"/>
+            </w:pPr>
+            <w:r>
+              <w:rPr>
+                <w:rFonts w:ascii="Yu Gothic" w:cs="Yu Gothic" w:eastAsia="Yu Gothic" w:hAnsi="Yu Gothic"/>
+                <w:sz w:val="19"/>
+                <w:szCs w:val="19"/>
+              </w:rPr>
+              <w:t xml:space="preserve">いつ</w:t>
+            </w:r>
+          </w:p>
+        </w:tc>
+        <w:tc>
+          <w:tcPr>
+            <w:tcW w:type="dxa" w:w="8138"/>
+            <w:tcMar>
+              <w:top w:type="dxa" w:w="60"/>
+              <w:left w:type="dxa" w:w="100"/>
+              <w:bottom w:type="dxa" w:w="60"/>
+              <w:right w:type="dxa" w:w="100"/>
+            </w:tcMar>
+          </w:tcPr>
+          <w:p>
+            <w:pPr>
+              <w:spacing w:after="0" w:line="280"/>
+            </w:pPr>
+            <w:r>
+              <w:rPr>
+                <w:rFonts w:ascii="Yu Gothic" w:cs="Yu Gothic" w:eastAsia="Yu Gothic" w:hAnsi="Yu Gothic"/>
+                <w:sz w:val="19"/>
+                <w:szCs w:val="19"/>
+              </w:rPr>
+              <w:t xml:space="preserve">導入時に1回。以後は変えたいときだけ</w:t>
+            </w:r>
+          </w:p>
+        </w:tc>
+      </w:tr>
+      <w:tr>
+        <w:trPr>
+          <w:tblHeader w:val="false"/>
+        </w:trPr>
+        <w:tc>
+          <w:tcPr>
+            <w:tcW w:type="dxa" w:w="1500"/>
+            <w:tcMar>
+              <w:top w:type="dxa" w:w="60"/>
+              <w:left w:type="dxa" w:w="100"/>
+              <w:bottom w:type="dxa" w:w="60"/>
+              <w:right w:type="dxa" w:w="100"/>
+            </w:tcMar>
+          </w:tcPr>
+          <w:p>
+            <w:pPr>
+              <w:spacing w:after="0" w:line="280"/>
+            </w:pPr>
+            <w:r>
+              <w:rPr>
+                <w:rFonts w:ascii="Yu Gothic" w:cs="Yu Gothic" w:eastAsia="Yu Gothic" w:hAnsi="Yu Gothic"/>
+                <w:sz w:val="19"/>
+                <w:szCs w:val="19"/>
+              </w:rPr>
+              <w:t xml:space="preserve">誰が</w:t>
+            </w:r>
+          </w:p>
+        </w:tc>
+        <w:tc>
+          <w:tcPr>
+            <w:tcW w:type="dxa" w:w="8138"/>
+            <w:tcMar>
+              <w:top w:type="dxa" w:w="60"/>
+              <w:left w:type="dxa" w:w="100"/>
+              <w:bottom w:type="dxa" w:w="60"/>
+              <w:right w:type="dxa" w:w="100"/>
+            </w:tcMar>
+          </w:tcPr>
+          <w:p>
+            <w:pPr>
+              <w:spacing w:after="0" w:line="280"/>
+            </w:pPr>
+            <w:r>
+              <w:rPr>
+                <w:rFonts w:ascii="Yu Gothic" w:cs="Yu Gothic" w:eastAsia="Yu Gothic" w:hAnsi="Yu Gothic"/>
+                <w:sz w:val="19"/>
+                <w:szCs w:val="19"/>
+              </w:rPr>
+              <w:t xml:space="preserve">経理担当</w:t>
+            </w:r>
+          </w:p>
+        </w:tc>
+      </w:tr>
+      <w:tr>
+        <w:trPr>
+          <w:tblHeader w:val="false"/>
+        </w:trPr>
+        <w:tc>
+          <w:tcPr>
+            <w:tcW w:type="dxa" w:w="1500"/>
+            <w:tcMar>
+              <w:top w:type="dxa" w:w="60"/>
+              <w:left w:type="dxa" w:w="100"/>
+              <w:bottom w:type="dxa" w:w="60"/>
+              <w:right w:type="dxa" w:w="100"/>
+            </w:tcMar>
+          </w:tcPr>
+          <w:p>
+            <w:pPr>
+              <w:spacing w:after="0" w:line="280"/>
+            </w:pPr>
+            <w:r>
+              <w:rPr>
+                <w:rFonts w:ascii="Yu Gothic" w:cs="Yu Gothic" w:eastAsia="Yu Gothic" w:hAnsi="Yu Gothic"/>
+                <w:sz w:val="19"/>
+                <w:szCs w:val="19"/>
+              </w:rPr>
+              <w:t xml:space="preserve">所要</w:t>
+            </w:r>
+          </w:p>
+        </w:tc>
+        <w:tc>
+          <w:tcPr>
+            <w:tcW w:type="dxa" w:w="8138"/>
+            <w:tcMar>
+              <w:top w:type="dxa" w:w="60"/>
+              <w:left w:type="dxa" w:w="100"/>
+              <w:bottom w:type="dxa" w:w="60"/>
+              <w:right w:type="dxa" w:w="100"/>
+            </w:tcMar>
+          </w:tcPr>
+          <w:p>
+            <w:pPr>
+              <w:spacing w:after="0" w:line="280"/>
+            </w:pPr>
+            <w:r>
+              <w:rPr>
+                <w:rFonts w:ascii="Yu Gothic" w:cs="Yu Gothic" w:eastAsia="Yu Gothic" w:hAnsi="Yu Gothic"/>
+                <w:sz w:val="19"/>
+                <w:szCs w:val="19"/>
+              </w:rPr>
+              <w:t xml:space="preserve">5分</w:t>
+            </w:r>
+          </w:p>
+        </w:tc>
+      </w:tr>
+    </w:tbl>
+    <w:p>
+      <w:pPr>
+        <w:spacing w:after="100"/>
+      </w:pPr>
+    </w:p>
+    <w:p>
+      <w:pPr>
+        <w:spacing w:after="60" w:line="300"/>
+        <w:ind w:left="340" w:hanging="340"/>
+      </w:pPr>
+      <w:r>
+        <w:rPr>
+          <w:rFonts w:ascii="Yu Gothic" w:cs="Yu Gothic" w:eastAsia="Yu Gothic" w:hAnsi="Yu Gothic"/>
+          <w:b/>
+          <w:bCs/>
+          <w:sz w:val="21"/>
+          <w:szCs w:val="21"/>
+        </w:rPr>
+        <w:t xml:space="preserve">1．</w:t>
+      </w:r>
+      <w:r>
+        <w:rPr>
+          <w:rFonts w:ascii="Yu Gothic" w:cs="Yu Gothic" w:eastAsia="Yu Gothic" w:hAnsi="Yu Gothic"/>
+          <w:sz w:val="21"/>
+          <w:szCs w:val="21"/>
+        </w:rPr>
+        <w:t xml:space="preserve">「⏰ 自動実行」を開く</w:t>
+      </w:r>
+    </w:p>
+    <w:p>
+      <w:pPr>
+        <w:spacing w:after="60" w:line="300"/>
+        <w:ind w:left="340" w:hanging="340"/>
+      </w:pPr>
+      <w:r>
+        <w:rPr>
+          <w:rFonts w:ascii="Yu Gothic" w:cs="Yu Gothic" w:eastAsia="Yu Gothic" w:hAnsi="Yu Gothic"/>
+          <w:b/>
+          <w:bCs/>
+          <w:sz w:val="21"/>
+          <w:szCs w:val="21"/>
+        </w:rPr>
+        <w:t xml:space="preserve">2．</w:t>
+      </w:r>
+      <w:r>
+        <w:rPr>
+          <w:rFonts w:ascii="Yu Gothic" w:cs="Yu Gothic" w:eastAsia="Yu Gothic" w:hAnsi="Yu Gothic"/>
+          <w:sz w:val="21"/>
+          <w:szCs w:val="21"/>
+        </w:rPr>
+        <w:t xml:space="preserve">表で、動かしたいものに「自動で実行」のチェックを入れる（既定は全部オン）</w:t>
+      </w:r>
+    </w:p>
+    <w:p>
+      <w:pPr>
+        <w:spacing w:after="60" w:line="300"/>
+        <w:ind w:left="340" w:hanging="340"/>
+      </w:pPr>
+      <w:r>
+        <w:rPr>
+          <w:rFonts w:ascii="Yu Gothic" w:cs="Yu Gothic" w:eastAsia="Yu Gothic" w:hAnsi="Yu Gothic"/>
+          <w:b/>
+          <w:bCs/>
+          <w:sz w:val="21"/>
+          <w:szCs w:val="21"/>
+        </w:rPr>
+        <w:t xml:space="preserve">3．</w:t>
+      </w:r>
+      <w:r>
+        <w:rPr>
+          <w:rFonts w:ascii="Yu Gothic" w:cs="Yu Gothic" w:eastAsia="Yu Gothic" w:hAnsi="Yu Gothic"/>
+          <w:sz w:val="21"/>
+          <w:szCs w:val="21"/>
+        </w:rPr>
+        <w:t xml:space="preserve">「いつ走らせるか」で頻度と時刻を選ぶ。選んだ時点で保存される</w:t>
+      </w:r>
+    </w:p>
+    <w:p>
+      <w:pPr>
+        <w:spacing w:after="60" w:line="300"/>
+        <w:ind w:left="340" w:hanging="340"/>
+      </w:pPr>
+      <w:r>
+        <w:rPr>
+          <w:rFonts w:ascii="Yu Gothic" w:cs="Yu Gothic" w:eastAsia="Yu Gothic" w:hAnsi="Yu Gothic"/>
+          <w:b/>
+          <w:bCs/>
+          <w:sz w:val="21"/>
+          <w:szCs w:val="21"/>
+        </w:rPr>
+        <w:t xml:space="preserve">4．</w:t>
+      </w:r>
+      <w:r>
+        <w:rPr>
+          <w:rFonts w:ascii="Yu Gothic" w:cs="Yu Gothic" w:eastAsia="Yu Gothic" w:hAnsi="Yu Gothic"/>
+          <w:sz w:val="21"/>
+          <w:szCs w:val="21"/>
+        </w:rPr>
+        <w:t xml:space="preserve">はじめての場合は「➕ はじめて設定する」、変更した場合は「🔄 変更を反映する」を押す</w:t>
+      </w:r>
+    </w:p>
+    <w:p>
+      <w:pPr>
+        <w:spacing w:after="60" w:line="300"/>
+        <w:ind w:left="340" w:hanging="340"/>
+      </w:pPr>
+      <w:r>
+        <w:rPr>
+          <w:rFonts w:ascii="Yu Gothic" w:cs="Yu Gothic" w:eastAsia="Yu Gothic" w:hAnsi="Yu Gothic"/>
+          <w:b/>
+          <w:bCs/>
+          <w:sz w:val="21"/>
+          <w:szCs w:val="21"/>
+        </w:rPr>
+        <w:t xml:space="preserve">5．</w:t>
+      </w:r>
+      <w:r>
+        <w:rPr>
+          <w:rFonts w:ascii="Yu Gothic" w:cs="Yu Gothic" w:eastAsia="Yu Gothic" w:hAnsi="Yu Gothic"/>
+          <w:sz w:val="21"/>
+          <w:szCs w:val="21"/>
+        </w:rPr>
+        <w:t xml:space="preserve">Cowork が開くので、内容を確認して送信する。差分が一覧で出るので、承認する</w:t>
+      </w:r>
+    </w:p>
+    <w:p>
+      <w:pPr>
+        <w:spacing w:after="60" w:line="300"/>
+        <w:ind w:left="340" w:hanging="340"/>
+      </w:pPr>
+      <w:r>
+        <w:rPr>
+          <w:rFonts w:ascii="Yu Gothic" w:cs="Yu Gothic" w:eastAsia="Yu Gothic" w:hAnsi="Yu Gothic"/>
+          <w:b/>
+          <w:bCs/>
+          <w:sz w:val="21"/>
+          <w:szCs w:val="21"/>
+        </w:rPr>
+        <w:t xml:space="preserve">6．</w:t>
+      </w:r>
+      <w:r>
+        <w:rPr>
+          <w:rFonts w:ascii="Yu Gothic" w:cs="Yu Gothic" w:eastAsia="Yu Gothic" w:hAnsi="Yu Gothic"/>
+          <w:sz w:val="21"/>
+          <w:szCs w:val="21"/>
+        </w:rPr>
+        <w:t xml:space="preserve">設定できたら、各行の「▶ 今すぐ」を1回押しておく（後述の理由）</w:t>
+      </w:r>
+    </w:p>
+    <w:p>
+      <w:pPr>
+        <w:spacing w:after="100"/>
+      </w:pPr>
+    </w:p>
+    <w:tbl>
+      <w:tblPr>
+        <w:tblW w:type="dxa" w:w="9638"/>
+        <w:tblBorders>
+          <w:top w:val="single" w:color="auto" w:sz="4"/>
+          <w:left w:val="single" w:color="auto" w:sz="4"/>
+          <w:bottom w:val="single" w:color="auto" w:sz="4"/>
+          <w:right w:val="single" w:color="auto" w:sz="4"/>
+          <w:insideH w:val="single" w:color="auto" w:sz="4"/>
+          <w:insideV w:val="single" w:color="auto" w:sz="4"/>
+        </w:tblBorders>
+      </w:tblPr>
+      <w:tblGrid>
+        <w:gridCol w:w="2400"/>
+        <w:gridCol w:w="7238"/>
+      </w:tblGrid>
+      <w:tr>
+        <w:trPr>
+          <w:tblHeader/>
+        </w:trPr>
+        <w:tc>
+          <w:tcPr>
+            <w:tcW w:type="dxa" w:w="2400"/>
+            <w:shd w:fill="F2F2F2" w:val="clear"/>
+            <w:tcMar>
+              <w:top w:type="dxa" w:w="60"/>
+              <w:left w:type="dxa" w:w="100"/>
+              <w:bottom w:type="dxa" w:w="60"/>
+              <w:right w:type="dxa" w:w="100"/>
+            </w:tcMar>
+          </w:tcPr>
+          <w:p>
+            <w:pPr>
+              <w:spacing w:after="0" w:line="280"/>
+            </w:pPr>
+            <w:r>
+              <w:rPr>
+                <w:rFonts w:ascii="Yu Gothic" w:cs="Yu Gothic" w:eastAsia="Yu Gothic" w:hAnsi="Yu Gothic"/>
+                <w:b/>
+                <w:bCs/>
+                <w:sz w:val="19"/>
+                <w:szCs w:val="19"/>
+              </w:rPr>
+              <w:t xml:space="preserve">ボタン</w:t>
+            </w:r>
+          </w:p>
+        </w:tc>
+        <w:tc>
+          <w:tcPr>
+            <w:tcW w:type="dxa" w:w="7238"/>
+            <w:shd w:fill="F2F2F2" w:val="clear"/>
+            <w:tcMar>
+              <w:top w:type="dxa" w:w="60"/>
+              <w:left w:type="dxa" w:w="100"/>
+              <w:bottom w:type="dxa" w:w="60"/>
+              <w:right w:type="dxa" w:w="100"/>
+            </w:tcMar>
+          </w:tcPr>
+          <w:p>
+            <w:pPr>
+              <w:spacing w:after="0" w:line="280"/>
+            </w:pPr>
+            <w:r>
+              <w:rPr>
+                <w:rFonts w:ascii="Yu Gothic" w:cs="Yu Gothic" w:eastAsia="Yu Gothic" w:hAnsi="Yu Gothic"/>
+                <w:b/>
+                <w:bCs/>
+                <w:sz w:val="19"/>
+                <w:szCs w:val="19"/>
+              </w:rPr>
+              <w:t xml:space="preserve">何が起きるか</w:t>
+            </w:r>
+          </w:p>
+        </w:tc>
+      </w:tr>
+      <w:tr>
+        <w:trPr>
+          <w:tblHeader w:val="false"/>
+        </w:trPr>
+        <w:tc>
+          <w:tcPr>
+            <w:tcW w:type="dxa" w:w="2400"/>
+            <w:tcMar>
+              <w:top w:type="dxa" w:w="60"/>
+              <w:left w:type="dxa" w:w="100"/>
+              <w:bottom w:type="dxa" w:w="60"/>
+              <w:right w:type="dxa" w:w="100"/>
+            </w:tcMar>
+          </w:tcPr>
+          <w:p>
+            <w:pPr>
+              <w:spacing w:after="0" w:line="280"/>
+            </w:pPr>
+            <w:r>
+              <w:rPr>
+                <w:rFonts w:ascii="Yu Gothic" w:cs="Yu Gothic" w:eastAsia="Yu Gothic" w:hAnsi="Yu Gothic"/>
+                <w:sz w:val="19"/>
+                <w:szCs w:val="19"/>
+              </w:rPr>
+              <w:t xml:space="preserve">➕ はじめて設定する</w:t>
+            </w:r>
+          </w:p>
+        </w:tc>
+        <w:tc>
+          <w:tcPr>
+            <w:tcW w:type="dxa" w:w="7238"/>
+            <w:tcMar>
+              <w:top w:type="dxa" w:w="60"/>
+              <w:left w:type="dxa" w:w="100"/>
+              <w:bottom w:type="dxa" w:w="60"/>
+              <w:right w:type="dxa" w:w="100"/>
+            </w:tcMar>
+          </w:tcPr>
+          <w:p>
+            <w:pPr>
+              <w:spacing w:after="0" w:line="280"/>
+            </w:pPr>
+            <w:r>
+              <w:rPr>
+                <w:rFonts w:ascii="Yu Gothic" w:cs="Yu Gothic" w:eastAsia="Yu Gothic" w:hAnsi="Yu Gothic"/>
+                <w:sz w:val="19"/>
+                <w:szCs w:val="19"/>
+              </w:rPr>
+              <w:t xml:space="preserve">まだ設定されていないものを設定する。既にあるものは触らない</w:t>
+            </w:r>
+          </w:p>
+        </w:tc>
+      </w:tr>
+      <w:tr>
+        <w:trPr>
+          <w:tblHeader w:val="false"/>
+        </w:trPr>
+        <w:tc>
+          <w:tcPr>
+            <w:tcW w:type="dxa" w:w="2400"/>
+            <w:tcMar>
+              <w:top w:type="dxa" w:w="60"/>
+              <w:left w:type="dxa" w:w="100"/>
+              <w:bottom w:type="dxa" w:w="60"/>
+              <w:right w:type="dxa" w:w="100"/>
+            </w:tcMar>
+          </w:tcPr>
+          <w:p>
+            <w:pPr>
+              <w:spacing w:after="0" w:line="280"/>
+            </w:pPr>
+            <w:r>
+              <w:rPr>
+                <w:rFonts w:ascii="Yu Gothic" w:cs="Yu Gothic" w:eastAsia="Yu Gothic" w:hAnsi="Yu Gothic"/>
+                <w:sz w:val="19"/>
+                <w:szCs w:val="19"/>
+              </w:rPr>
+              <w:t xml:space="preserve">🔄 変更を反映する</w:t>
+            </w:r>
+          </w:p>
+        </w:tc>
+        <w:tc>
+          <w:tcPr>
+            <w:tcW w:type="dxa" w:w="7238"/>
+            <w:tcMar>
+              <w:top w:type="dxa" w:w="60"/>
+              <w:left w:type="dxa" w:w="100"/>
+              <w:bottom w:type="dxa" w:w="60"/>
+              <w:right w:type="dxa" w:w="100"/>
+            </w:tcMar>
+          </w:tcPr>
+          <w:p>
+            <w:pPr>
+              <w:spacing w:after="0" w:line="280"/>
+            </w:pPr>
+            <w:r>
+              <w:rPr>
+                <w:rFonts w:ascii="Yu Gothic" w:cs="Yu Gothic" w:eastAsia="Yu Gothic" w:hAnsi="Yu Gothic"/>
+                <w:sz w:val="19"/>
+                <w:szCs w:val="19"/>
+              </w:rPr>
+              <w:t xml:space="preserve">表の内容どおりに直す。チェックを外したものは自動実行から外れる</w:t>
+            </w:r>
+          </w:p>
+        </w:tc>
+      </w:tr>
+      <w:tr>
+        <w:trPr>
+          <w:tblHeader w:val="false"/>
+        </w:trPr>
+        <w:tc>
+          <w:tcPr>
+            <w:tcW w:type="dxa" w:w="2400"/>
+            <w:tcMar>
+              <w:top w:type="dxa" w:w="60"/>
+              <w:left w:type="dxa" w:w="100"/>
+              <w:bottom w:type="dxa" w:w="60"/>
+              <w:right w:type="dxa" w:w="100"/>
+            </w:tcMar>
+          </w:tcPr>
+          <w:p>
+            <w:pPr>
+              <w:spacing w:after="0" w:line="280"/>
+            </w:pPr>
+            <w:r>
+              <w:rPr>
+                <w:rFonts w:ascii="Yu Gothic" w:cs="Yu Gothic" w:eastAsia="Yu Gothic" w:hAnsi="Yu Gothic"/>
+                <w:sz w:val="19"/>
+                <w:szCs w:val="19"/>
+              </w:rPr>
+              <w:t xml:space="preserve">🔍 今の状態を見る</w:t>
+            </w:r>
+          </w:p>
+        </w:tc>
+        <w:tc>
+          <w:tcPr>
+            <w:tcW w:type="dxa" w:w="7238"/>
+            <w:tcMar>
+              <w:top w:type="dxa" w:w="60"/>
+              <w:left w:type="dxa" w:w="100"/>
+              <w:bottom w:type="dxa" w:w="60"/>
+              <w:right w:type="dxa" w:w="100"/>
+            </w:tcMar>
+          </w:tcPr>
+          <w:p>
+            <w:pPr>
+              <w:spacing w:after="0" w:line="280"/>
+            </w:pPr>
+            <w:r>
+              <w:rPr>
+                <w:rFonts w:ascii="Yu Gothic" w:cs="Yu Gothic" w:eastAsia="Yu Gothic" w:hAnsi="Yu Gothic"/>
+                <w:sz w:val="19"/>
+                <w:szCs w:val="19"/>
+              </w:rPr>
+              <w:t xml:space="preserve">今どうなっているかを読むだけ。何も変えない</w:t>
+            </w:r>
+          </w:p>
+        </w:tc>
+      </w:tr>
+      <w:tr>
+        <w:trPr>
+          <w:tblHeader w:val="false"/>
+        </w:trPr>
+        <w:tc>
+          <w:tcPr>
+            <w:tcW w:type="dxa" w:w="2400"/>
+            <w:tcMar>
+              <w:top w:type="dxa" w:w="60"/>
+              <w:left w:type="dxa" w:w="100"/>
+              <w:bottom w:type="dxa" w:w="60"/>
+              <w:right w:type="dxa" w:w="100"/>
+            </w:tcMar>
+          </w:tcPr>
+          <w:p>
+            <w:pPr>
+              <w:spacing w:after="0" w:line="280"/>
+            </w:pPr>
+            <w:r>
+              <w:rPr>
+                <w:rFonts w:ascii="Yu Gothic" w:cs="Yu Gothic" w:eastAsia="Yu Gothic" w:hAnsi="Yu Gothic"/>
+                <w:sz w:val="19"/>
+                <w:szCs w:val="19"/>
+              </w:rPr>
+              <w:t xml:space="preserve">🗑️ 全部やめる</w:t>
+            </w:r>
+          </w:p>
+        </w:tc>
+        <w:tc>
+          <w:tcPr>
+            <w:tcW w:type="dxa" w:w="7238"/>
+            <w:tcMar>
+              <w:top w:type="dxa" w:w="60"/>
+              <w:left w:type="dxa" w:w="100"/>
+              <w:bottom w:type="dxa" w:w="60"/>
+              <w:right w:type="dxa" w:w="100"/>
+            </w:tcMar>
+          </w:tcPr>
+          <w:p>
+            <w:pPr>
+              <w:spacing w:after="0" w:line="280"/>
+            </w:pPr>
+            <w:r>
+              <w:rPr>
+                <w:rFonts w:ascii="Yu Gothic" w:cs="Yu Gothic" w:eastAsia="Yu Gothic" w:hAnsi="Yu Gothic"/>
+                <w:sz w:val="19"/>
+                <w:szCs w:val="19"/>
+              </w:rPr>
+              <w:t xml:space="preserve">7本すべてを自動実行から外す。手動の「▶ 今すぐ」は使える</w:t>
+            </w:r>
+          </w:p>
+        </w:tc>
+      </w:tr>
+      <w:tr>
+        <w:trPr>
+          <w:tblHeader w:val="false"/>
+        </w:trPr>
+        <w:tc>
+          <w:tcPr>
+            <w:tcW w:type="dxa" w:w="2400"/>
+            <w:tcMar>
+              <w:top w:type="dxa" w:w="60"/>
+              <w:left w:type="dxa" w:w="100"/>
+              <w:bottom w:type="dxa" w:w="60"/>
+              <w:right w:type="dxa" w:w="100"/>
+            </w:tcMar>
+          </w:tcPr>
+          <w:p>
+            <w:pPr>
+              <w:spacing w:after="0" w:line="280"/>
+            </w:pPr>
+            <w:r>
+              <w:rPr>
+                <w:rFonts w:ascii="Yu Gothic" w:cs="Yu Gothic" w:eastAsia="Yu Gothic" w:hAnsi="Yu Gothic"/>
+                <w:sz w:val="19"/>
+                <w:szCs w:val="19"/>
+              </w:rPr>
+              <w:t xml:space="preserve">↩️ おすすめの時刻に戻す</w:t>
+            </w:r>
+          </w:p>
+        </w:tc>
+        <w:tc>
+          <w:tcPr>
+            <w:tcW w:type="dxa" w:w="7238"/>
+            <w:tcMar>
+              <w:top w:type="dxa" w:w="60"/>
+              <w:left w:type="dxa" w:w="100"/>
+              <w:bottom w:type="dxa" w:w="60"/>
+              <w:right w:type="dxa" w:w="100"/>
+            </w:tcMar>
+          </w:tcPr>
+          <w:p>
+            <w:pPr>
+              <w:spacing w:after="0" w:line="280"/>
+            </w:pPr>
+            <w:r>
+              <w:rPr>
+                <w:rFonts w:ascii="Yu Gothic" w:cs="Yu Gothic" w:eastAsia="Yu Gothic" w:hAnsi="Yu Gothic"/>
+                <w:sz w:val="19"/>
+                <w:szCs w:val="19"/>
+              </w:rPr>
+              <w:t xml:space="preserve">表の時刻を初期値に戻す（この時点では反映されない）</w:t>
+            </w:r>
+          </w:p>
+        </w:tc>
+      </w:tr>
+    </w:tbl>
+    <w:p>
+      <w:pPr>
+        <w:pBdr>
+          <w:left w:val="single" w:color="BFBFBF" w:sz="12" w:space="8"/>
+        </w:pBdr>
+        <w:spacing w:after="140" w:before="80" w:line="300"/>
+        <w:ind w:left="200"/>
+      </w:pPr>
+      <w:r>
+        <w:rPr>
+          <w:rFonts w:ascii="Yu Gothic" w:cs="Yu Gothic" w:eastAsia="Yu Gothic" w:hAnsi="Yu Gothic"/>
+          <w:color w:val="404040"/>
+          <w:sz w:val="20"/>
+          <w:szCs w:val="20"/>
+        </w:rPr>
+        <w:t xml:space="preserve">設定した直後に「▶ 今すぐ」を1回押してください。初回はメールなどへのアクセス許可を聞かれます。先に通しておかないと、朝の自動実行が許可待ちで止まり、報告が来ません。</w:t>
+      </w:r>
+    </w:p>
+    <w:p>
+      <w:pPr>
+        <w:spacing w:after="100"/>
+      </w:pPr>
+    </w:p>
+    <w:p>
+      <w:pPr>
+        <w:spacing w:after="100" w:line="300"/>
+      </w:pPr>
+      <w:r>
+        <w:rPr>
+          <w:rFonts w:ascii="Yu Gothic" w:cs="Yu Gothic" w:eastAsia="Yu Gothic" w:hAnsi="Yu Gothic"/>
+          <w:b/>
+          <w:bCs/>
+          <w:sz w:val="21"/>
+          <w:szCs w:val="21"/>
+        </w:rPr>
+        <w:t xml:space="preserve">頻度を変えると「どこまで見るか」も自動で変わります。</w:t>
+      </w:r>
+    </w:p>
+    <w:p>
+      <w:pPr>
+        <w:spacing w:after="120" w:line="300"/>
+      </w:pPr>
+      <w:r>
+        <w:rPr>
+          <w:rFonts w:ascii="Yu Gothic" w:cs="Yu Gothic" w:eastAsia="Yu Gothic" w:hAnsi="Yu Gothic"/>
+          <w:sz w:val="21"/>
+          <w:szCs w:val="21"/>
+        </w:rPr>
+        <w:t xml:space="preserve">毎日なら直近2日ぶん、毎週なら直近8日ぶん、毎月なら直近35日ぶんを見ます。週1回にしたのに2日ぶんしか見ないと、5日ぶん取りこぼすためです。頻度より長く取ってあるのは、実行が1回飛んでも穴が空かないようにするためです。</w:t>
+      </w:r>
+    </w:p>
+    <w:p>
+      <w:pPr>
+        <w:spacing w:after="100" w:line="300"/>
+      </w:pPr>
+      <w:r>
+        <w:rPr>
+          <w:rFonts w:ascii="Yu Gothic" w:cs="Yu Gothic" w:eastAsia="Yu Gothic" w:hAnsi="Yu Gothic"/>
+          <w:b/>
+          <w:bCs/>
+          <w:sz w:val="21"/>
+          <w:szCs w:val="21"/>
+        </w:rPr>
+        <w:t xml:space="preserve">毎月のものは日付だけ選べます（1〜28日）。</w:t>
+      </w:r>
+    </w:p>
+    <w:p>
+      <w:pPr>
+        <w:spacing w:after="140" w:line="300"/>
+      </w:pPr>
+      <w:r>
+        <w:rPr>
+          <w:rFonts w:ascii="Yu Gothic" w:cs="Yu Gothic" w:eastAsia="Yu Gothic" w:hAnsi="Yu Gothic"/>
+          <w:sz w:val="21"/>
+          <w:szCs w:val="21"/>
+        </w:rPr>
+        <w:t xml:space="preserve">「先月の売上が会計に入っているか」を毎日走らせても意味がないため、月次の会計に紐づくものは毎月固定です。29〜31日を選べないのは、その日が無い月に実行されなくなるからです。</w:t>
+      </w:r>
+    </w:p>
+    <w:p>
+      <w:pPr>
+        <w:pStyle w:val="Heading2"/>
+        <w:spacing w:after="80" w:before="280"/>
+      </w:pPr>
+      <w:r>
+        <w:rPr>
+          <w:rFonts w:ascii="Yu Gothic" w:cs="Yu Gothic" w:eastAsia="Yu Gothic" w:hAnsi="Yu Gothic"/>
+          <w:b/>
+          <w:bCs/>
+          <w:sz w:val="24"/>
+          <w:szCs w:val="24"/>
+        </w:rPr>
+        <w:t xml:space="preserve">手順14　動いているか確かめる</w:t>
+      </w:r>
+    </w:p>
+    <w:tbl>
+      <w:tblPr>
+        <w:tblW w:type="dxa" w:w="9638"/>
+        <w:tblBorders>
+          <w:top w:val="single" w:color="auto" w:sz="4"/>
+          <w:left w:val="single" w:color="auto" w:sz="4"/>
+          <w:bottom w:val="single" w:color="auto" w:sz="4"/>
+          <w:right w:val="single" w:color="auto" w:sz="4"/>
+          <w:insideH w:val="single" w:color="auto" w:sz="4"/>
+          <w:insideV w:val="single" w:color="auto" w:sz="4"/>
+        </w:tblBorders>
+      </w:tblPr>
+      <w:tblGrid>
+        <w:gridCol w:w="1500"/>
+        <w:gridCol w:w="8138"/>
+      </w:tblGrid>
+      <w:tr>
+        <w:trPr>
+          <w:tblHeader w:val="false"/>
+        </w:trPr>
+        <w:tc>
+          <w:tcPr>
+            <w:tcW w:type="dxa" w:w="1500"/>
+            <w:tcMar>
+              <w:top w:type="dxa" w:w="60"/>
+              <w:left w:type="dxa" w:w="100"/>
+              <w:bottom w:type="dxa" w:w="60"/>
+              <w:right w:type="dxa" w:w="100"/>
+            </w:tcMar>
+          </w:tcPr>
+          <w:p>
+            <w:pPr>
+              <w:spacing w:after="0" w:line="280"/>
+            </w:pPr>
+            <w:r>
+              <w:rPr>
+                <w:rFonts w:ascii="Yu Gothic" w:cs="Yu Gothic" w:eastAsia="Yu Gothic" w:hAnsi="Yu Gothic"/>
+                <w:sz w:val="19"/>
+                <w:szCs w:val="19"/>
+              </w:rPr>
+              <w:t xml:space="preserve">いつ</w:t>
+            </w:r>
+          </w:p>
+        </w:tc>
+        <w:tc>
+          <w:tcPr>
+            <w:tcW w:type="dxa" w:w="8138"/>
+            <w:tcMar>
+              <w:top w:type="dxa" w:w="60"/>
+              <w:left w:type="dxa" w:w="100"/>
+              <w:bottom w:type="dxa" w:w="60"/>
+              <w:right w:type="dxa" w:w="100"/>
+            </w:tcMar>
+          </w:tcPr>
+          <w:p>
+            <w:pPr>
+              <w:spacing w:after="0" w:line="280"/>
+            </w:pPr>
+            <w:r>
+              <w:rPr>
+                <w:rFonts w:ascii="Yu Gothic" w:cs="Yu Gothic" w:eastAsia="Yu Gothic" w:hAnsi="Yu Gothic"/>
+                <w:sz w:val="19"/>
+                <w:szCs w:val="19"/>
+              </w:rPr>
+              <w:t xml:space="preserve">報告が来ていないと感じたとき</w:t>
+            </w:r>
+          </w:p>
+        </w:tc>
+      </w:tr>
+      <w:tr>
+        <w:trPr>
+          <w:tblHeader w:val="false"/>
+        </w:trPr>
+        <w:tc>
+          <w:tcPr>
+            <w:tcW w:type="dxa" w:w="1500"/>
+            <w:tcMar>
+              <w:top w:type="dxa" w:w="60"/>
+              <w:left w:type="dxa" w:w="100"/>
+              <w:bottom w:type="dxa" w:w="60"/>
+              <w:right w:type="dxa" w:w="100"/>
+            </w:tcMar>
+          </w:tcPr>
+          <w:p>
+            <w:pPr>
+              <w:spacing w:after="0" w:line="280"/>
+            </w:pPr>
+            <w:r>
+              <w:rPr>
+                <w:rFonts w:ascii="Yu Gothic" w:cs="Yu Gothic" w:eastAsia="Yu Gothic" w:hAnsi="Yu Gothic"/>
+                <w:sz w:val="19"/>
+                <w:szCs w:val="19"/>
+              </w:rPr>
+              <w:t xml:space="preserve">誰が</w:t>
+            </w:r>
+          </w:p>
+        </w:tc>
+        <w:tc>
+          <w:tcPr>
+            <w:tcW w:type="dxa" w:w="8138"/>
+            <w:tcMar>
+              <w:top w:type="dxa" w:w="60"/>
+              <w:left w:type="dxa" w:w="100"/>
+              <w:bottom w:type="dxa" w:w="60"/>
+              <w:right w:type="dxa" w:w="100"/>
+            </w:tcMar>
+          </w:tcPr>
+          <w:p>
+            <w:pPr>
+              <w:spacing w:after="0" w:line="280"/>
+            </w:pPr>
+            <w:r>
+              <w:rPr>
+                <w:rFonts w:ascii="Yu Gothic" w:cs="Yu Gothic" w:eastAsia="Yu Gothic" w:hAnsi="Yu Gothic"/>
+                <w:sz w:val="19"/>
+                <w:szCs w:val="19"/>
+              </w:rPr>
+              <w:t xml:space="preserve">経理担当</w:t>
+            </w:r>
+          </w:p>
+        </w:tc>
+      </w:tr>
+      <w:tr>
+        <w:trPr>
+          <w:tblHeader w:val="false"/>
+        </w:trPr>
+        <w:tc>
+          <w:tcPr>
+            <w:tcW w:type="dxa" w:w="1500"/>
+            <w:tcMar>
+              <w:top w:type="dxa" w:w="60"/>
+              <w:left w:type="dxa" w:w="100"/>
+              <w:bottom w:type="dxa" w:w="60"/>
+              <w:right w:type="dxa" w:w="100"/>
+            </w:tcMar>
+          </w:tcPr>
+          <w:p>
+            <w:pPr>
+              <w:spacing w:after="0" w:line="280"/>
+            </w:pPr>
+            <w:r>
+              <w:rPr>
+                <w:rFonts w:ascii="Yu Gothic" w:cs="Yu Gothic" w:eastAsia="Yu Gothic" w:hAnsi="Yu Gothic"/>
+                <w:sz w:val="19"/>
+                <w:szCs w:val="19"/>
+              </w:rPr>
+              <w:t xml:space="preserve">所要</w:t>
+            </w:r>
+          </w:p>
+        </w:tc>
+        <w:tc>
+          <w:tcPr>
+            <w:tcW w:type="dxa" w:w="8138"/>
+            <w:tcMar>
+              <w:top w:type="dxa" w:w="60"/>
+              <w:left w:type="dxa" w:w="100"/>
+              <w:bottom w:type="dxa" w:w="60"/>
+              <w:right w:type="dxa" w:w="100"/>
+            </w:tcMar>
+          </w:tcPr>
+          <w:p>
+            <w:pPr>
+              <w:spacing w:after="0" w:line="280"/>
+            </w:pPr>
+            <w:r>
+              <w:rPr>
+                <w:rFonts w:ascii="Yu Gothic" w:cs="Yu Gothic" w:eastAsia="Yu Gothic" w:hAnsi="Yu Gothic"/>
+                <w:sz w:val="19"/>
+                <w:szCs w:val="19"/>
+              </w:rPr>
+              <w:t xml:space="preserve">2分</w:t>
+            </w:r>
+          </w:p>
+        </w:tc>
+      </w:tr>
+    </w:tbl>
+    <w:p>
+      <w:pPr>
+        <w:spacing w:after="100"/>
+      </w:pPr>
+    </w:p>
+    <w:p>
+      <w:pPr>
+        <w:spacing w:after="60" w:line="300"/>
+        <w:ind w:left="340" w:hanging="340"/>
+      </w:pPr>
+      <w:r>
+        <w:rPr>
+          <w:rFonts w:ascii="Yu Gothic" w:cs="Yu Gothic" w:eastAsia="Yu Gothic" w:hAnsi="Yu Gothic"/>
+          <w:b/>
+          <w:bCs/>
+          <w:sz w:val="21"/>
+          <w:szCs w:val="21"/>
+        </w:rPr>
+        <w:t xml:space="preserve">1．</w:t>
+      </w:r>
+      <w:r>
+        <w:rPr>
+          <w:rFonts w:ascii="Yu Gothic" w:cs="Yu Gothic" w:eastAsia="Yu Gothic" w:hAnsi="Yu Gothic"/>
+          <w:sz w:val="21"/>
+          <w:szCs w:val="21"/>
+        </w:rPr>
+        <w:t xml:space="preserve">「⏰ 自動実行」を開いて「🔍 今の状態を見る」を押す</w:t>
+      </w:r>
+    </w:p>
+    <w:p>
+      <w:pPr>
+        <w:spacing w:after="60" w:line="300"/>
+        <w:ind w:left="340" w:hanging="340"/>
+      </w:pPr>
+      <w:r>
+        <w:rPr>
+          <w:rFonts w:ascii="Yu Gothic" w:cs="Yu Gothic" w:eastAsia="Yu Gothic" w:hAnsi="Yu Gothic"/>
+          <w:b/>
+          <w:bCs/>
+          <w:sz w:val="21"/>
+          <w:szCs w:val="21"/>
+        </w:rPr>
+        <w:t xml:space="preserve">2．</w:t>
+      </w:r>
+      <w:r>
+        <w:rPr>
+          <w:rFonts w:ascii="Yu Gothic" w:cs="Yu Gothic" w:eastAsia="Yu Gothic" w:hAnsi="Yu Gothic"/>
+          <w:sz w:val="21"/>
+          <w:szCs w:val="21"/>
+        </w:rPr>
+        <w:t xml:space="preserve">Cowork が開くので送信する。設定されているか・最後にいつ動いたか・次はいつかが表で出る</w:t>
+      </w:r>
+    </w:p>
+    <w:p>
+      <w:pPr>
+        <w:spacing w:after="60" w:line="300"/>
+        <w:ind w:left="340" w:hanging="340"/>
+      </w:pPr>
+      <w:r>
+        <w:rPr>
+          <w:rFonts w:ascii="Yu Gothic" w:cs="Yu Gothic" w:eastAsia="Yu Gothic" w:hAnsi="Yu Gothic"/>
+          <w:b/>
+          <w:bCs/>
+          <w:sz w:val="21"/>
+          <w:szCs w:val="21"/>
+        </w:rPr>
+        <w:t xml:space="preserve">3．</w:t>
+      </w:r>
+      <w:r>
+        <w:rPr>
+          <w:rFonts w:ascii="Yu Gothic" w:cs="Yu Gothic" w:eastAsia="Yu Gothic" w:hAnsi="Yu Gothic"/>
+          <w:sz w:val="21"/>
+          <w:szCs w:val="21"/>
+        </w:rPr>
+        <w:t xml:space="preserve">画面の時刻と実際の時刻が違っていたら、「🔄 変更を反映する」で揃える</w:t>
+      </w:r>
+    </w:p>
+    <w:p>
+      <w:pPr>
+        <w:pBdr>
+          <w:left w:val="single" w:color="BFBFBF" w:sz="12" w:space="8"/>
+        </w:pBdr>
+        <w:spacing w:after="140" w:before="80" w:line="300"/>
+        <w:ind w:left="200"/>
+      </w:pPr>
+      <w:r>
+        <w:rPr>
+          <w:rFonts w:ascii="Yu Gothic" w:cs="Yu Gothic" w:eastAsia="Yu Gothic" w:hAnsi="Yu Gothic"/>
+          <w:color w:val="404040"/>
+          <w:sz w:val="20"/>
+          <w:szCs w:val="20"/>
+        </w:rPr>
+        <w:t xml:space="preserve">画面の時刻は「こう動かしたい」という設定で、実際に動いている時刻は Claude 側が持っています。画面はそれを直接読めないため、突き合わせにこのボタンを使います。</w:t>
+      </w:r>
+    </w:p>
+    <w:p>
+      <w:pPr>
+        <w:spacing w:after="100"/>
+      </w:pPr>
+    </w:p>
+    <w:p>
+      <w:pPr>
+        <w:spacing w:after="100" w:line="300"/>
+      </w:pPr>
+      <w:r>
+        <w:rPr>
+          <w:rFonts w:ascii="Yu Gothic" w:cs="Yu Gothic" w:eastAsia="Yu Gothic" w:hAnsi="Yu Gothic"/>
+          <w:b/>
+          <w:bCs/>
+          <w:sz w:val="21"/>
+          <w:szCs w:val="21"/>
+        </w:rPr>
+        <w:t xml:space="preserve">報告が来ない理由で多いのは、次の3つです。</w:t>
+      </w:r>
+    </w:p>
+    <w:tbl>
+      <w:tblPr>
+        <w:tblW w:type="dxa" w:w="9638"/>
+        <w:tblBorders>
+          <w:top w:val="single" w:color="auto" w:sz="4"/>
+          <w:left w:val="single" w:color="auto" w:sz="4"/>
+          <w:bottom w:val="single" w:color="auto" w:sz="4"/>
+          <w:right w:val="single" w:color="auto" w:sz="4"/>
+          <w:insideH w:val="single" w:color="auto" w:sz="4"/>
+          <w:insideV w:val="single" w:color="auto" w:sz="4"/>
+        </w:tblBorders>
+      </w:tblPr>
+      <w:tblGrid>
+        <w:gridCol w:w="3200"/>
+        <w:gridCol w:w="6438"/>
+      </w:tblGrid>
+      <w:tr>
+        <w:trPr>
+          <w:tblHeader/>
+        </w:trPr>
+        <w:tc>
+          <w:tcPr>
+            <w:tcW w:type="dxa" w:w="3200"/>
+            <w:shd w:fill="F2F2F2" w:val="clear"/>
+            <w:tcMar>
+              <w:top w:type="dxa" w:w="60"/>
+              <w:left w:type="dxa" w:w="100"/>
+              <w:bottom w:type="dxa" w:w="60"/>
+              <w:right w:type="dxa" w:w="100"/>
+            </w:tcMar>
+          </w:tcPr>
+          <w:p>
+            <w:pPr>
+              <w:spacing w:after="0" w:line="280"/>
+            </w:pPr>
+            <w:r>
+              <w:rPr>
+                <w:rFonts w:ascii="Yu Gothic" w:cs="Yu Gothic" w:eastAsia="Yu Gothic" w:hAnsi="Yu Gothic"/>
+                <w:b/>
+                <w:bCs/>
+                <w:sz w:val="19"/>
+                <w:szCs w:val="19"/>
+              </w:rPr>
+              <w:t xml:space="preserve">症状</w:t>
+            </w:r>
+          </w:p>
+        </w:tc>
+        <w:tc>
+          <w:tcPr>
+            <w:tcW w:type="dxa" w:w="6438"/>
+            <w:shd w:fill="F2F2F2" w:val="clear"/>
+            <w:tcMar>
+              <w:top w:type="dxa" w:w="60"/>
+              <w:left w:type="dxa" w:w="100"/>
+              <w:bottom w:type="dxa" w:w="60"/>
+              <w:right w:type="dxa" w:w="100"/>
+            </w:tcMar>
+          </w:tcPr>
+          <w:p>
+            <w:pPr>
+              <w:spacing w:after="0" w:line="280"/>
+            </w:pPr>
+            <w:r>
+              <w:rPr>
+                <w:rFonts w:ascii="Yu Gothic" w:cs="Yu Gothic" w:eastAsia="Yu Gothic" w:hAnsi="Yu Gothic"/>
+                <w:b/>
+                <w:bCs/>
+                <w:sz w:val="19"/>
+                <w:szCs w:val="19"/>
+              </w:rPr>
+              <w:t xml:space="preserve">理由と対処</w:t>
+            </w:r>
+          </w:p>
+        </w:tc>
+      </w:tr>
+      <w:tr>
+        <w:trPr>
+          <w:tblHeader w:val="false"/>
+        </w:trPr>
+        <w:tc>
+          <w:tcPr>
+            <w:tcW w:type="dxa" w:w="3200"/>
+            <w:tcMar>
+              <w:top w:type="dxa" w:w="60"/>
+              <w:left w:type="dxa" w:w="100"/>
+              <w:bottom w:type="dxa" w:w="60"/>
+              <w:right w:type="dxa" w:w="100"/>
+            </w:tcMar>
+          </w:tcPr>
+          <w:p>
+            <w:pPr>
+              <w:spacing w:after="0" w:line="280"/>
+            </w:pPr>
+            <w:r>
+              <w:rPr>
+                <w:rFonts w:ascii="Yu Gothic" w:cs="Yu Gothic" w:eastAsia="Yu Gothic" w:hAnsi="Yu Gothic"/>
+                <w:sz w:val="19"/>
+                <w:szCs w:val="19"/>
+              </w:rPr>
+              <w:t xml:space="preserve">ずっと報告が来ない</w:t>
+            </w:r>
+          </w:p>
+        </w:tc>
+        <w:tc>
+          <w:tcPr>
+            <w:tcW w:type="dxa" w:w="6438"/>
+            <w:tcMar>
+              <w:top w:type="dxa" w:w="60"/>
+              <w:left w:type="dxa" w:w="100"/>
+              <w:bottom w:type="dxa" w:w="60"/>
+              <w:right w:type="dxa" w:w="100"/>
+            </w:tcMar>
+          </w:tcPr>
+          <w:p>
+            <w:pPr>
+              <w:spacing w:after="0" w:line="280"/>
+            </w:pPr>
+            <w:r>
+              <w:rPr>
+                <w:rFonts w:ascii="Yu Gothic" w:cs="Yu Gothic" w:eastAsia="Yu Gothic" w:hAnsi="Yu Gothic"/>
+                <w:sz w:val="19"/>
+                <w:szCs w:val="19"/>
+              </w:rPr>
+              <w:t xml:space="preserve">そもそも設定されていない。手順13で設定する</w:t>
+            </w:r>
+          </w:p>
+        </w:tc>
+      </w:tr>
+      <w:tr>
+        <w:trPr>
+          <w:tblHeader w:val="false"/>
+        </w:trPr>
+        <w:tc>
+          <w:tcPr>
+            <w:tcW w:type="dxa" w:w="3200"/>
+            <w:tcMar>
+              <w:top w:type="dxa" w:w="60"/>
+              <w:left w:type="dxa" w:w="100"/>
+              <w:bottom w:type="dxa" w:w="60"/>
+              <w:right w:type="dxa" w:w="100"/>
+            </w:tcMar>
+          </w:tcPr>
+          <w:p>
+            <w:pPr>
+              <w:spacing w:after="0" w:line="280"/>
+            </w:pPr>
+            <w:r>
+              <w:rPr>
+                <w:rFonts w:ascii="Yu Gothic" w:cs="Yu Gothic" w:eastAsia="Yu Gothic" w:hAnsi="Yu Gothic"/>
+                <w:sz w:val="19"/>
+                <w:szCs w:val="19"/>
+              </w:rPr>
+              <w:t xml:space="preserve">時刻がずれて届く</w:t>
+            </w:r>
+          </w:p>
+        </w:tc>
+        <w:tc>
+          <w:tcPr>
+            <w:tcW w:type="dxa" w:w="6438"/>
+            <w:tcMar>
+              <w:top w:type="dxa" w:w="60"/>
+              <w:left w:type="dxa" w:w="100"/>
+              <w:bottom w:type="dxa" w:w="60"/>
+              <w:right w:type="dxa" w:w="100"/>
+            </w:tcMar>
+          </w:tcPr>
+          <w:p>
+            <w:pPr>
+              <w:spacing w:after="0" w:line="280"/>
+            </w:pPr>
+            <w:r>
+              <w:rPr>
+                <w:rFonts w:ascii="Yu Gothic" w:cs="Yu Gothic" w:eastAsia="Yu Gothic" w:hAnsi="Yu Gothic"/>
+                <w:sz w:val="19"/>
+                <w:szCs w:val="19"/>
+              </w:rPr>
+              <w:t xml:space="preserve">アプリが閉じていた。自動実行はアプリが開いている間だけ動き、閉じていた分は次に開いたときに動く。故障ではない</w:t>
+            </w:r>
+          </w:p>
+        </w:tc>
+      </w:tr>
+      <w:tr>
+        <w:trPr>
+          <w:tblHeader w:val="false"/>
+        </w:trPr>
+        <w:tc>
+          <w:tcPr>
+            <w:tcW w:type="dxa" w:w="3200"/>
+            <w:tcMar>
+              <w:top w:type="dxa" w:w="60"/>
+              <w:left w:type="dxa" w:w="100"/>
+              <w:bottom w:type="dxa" w:w="60"/>
+              <w:right w:type="dxa" w:w="100"/>
+            </w:tcMar>
+          </w:tcPr>
+          <w:p>
+            <w:pPr>
+              <w:spacing w:after="0" w:line="280"/>
+            </w:pPr>
+            <w:r>
+              <w:rPr>
+                <w:rFonts w:ascii="Yu Gothic" w:cs="Yu Gothic" w:eastAsia="Yu Gothic" w:hAnsi="Yu Gothic"/>
+                <w:sz w:val="19"/>
+                <w:szCs w:val="19"/>
+              </w:rPr>
+              <w:t xml:space="preserve">一度も動いた記録がない</w:t>
+            </w:r>
+          </w:p>
+        </w:tc>
+        <w:tc>
+          <w:tcPr>
+            <w:tcW w:type="dxa" w:w="6438"/>
+            <w:tcMar>
+              <w:top w:type="dxa" w:w="60"/>
+              <w:left w:type="dxa" w:w="100"/>
+              <w:bottom w:type="dxa" w:w="60"/>
+              <w:right w:type="dxa" w:w="100"/>
+            </w:tcMar>
+          </w:tcPr>
+          <w:p>
+            <w:pPr>
+              <w:spacing w:after="0" w:line="280"/>
+            </w:pPr>
+            <w:r>
+              <w:rPr>
+                <w:rFonts w:ascii="Yu Gothic" w:cs="Yu Gothic" w:eastAsia="Yu Gothic" w:hAnsi="Yu Gothic"/>
+                <w:sz w:val="19"/>
+                <w:szCs w:val="19"/>
+              </w:rPr>
+              <w:t xml:space="preserve">初回の許可待ちで止まっている。「▶ 今すぐ」を1回押して許可を通す</w:t>
+            </w:r>
+          </w:p>
+        </w:tc>
+      </w:tr>
+    </w:tbl>
+    <w:p>
+      <w:pPr>
+        <w:pBdr>
+          <w:left w:val="single" w:color="BFBFBF" w:sz="12" w:space="8"/>
+        </w:pBdr>
+        <w:spacing w:after="140" w:before="80" w:line="300"/>
+        <w:ind w:left="200"/>
+      </w:pPr>
+      <w:r>
+        <w:rPr>
+          <w:rFonts w:ascii="Yu Gothic" w:cs="Yu Gothic" w:eastAsia="Yu Gothic" w:hAnsi="Yu Gothic"/>
+          <w:color w:val="404040"/>
+          <w:sz w:val="20"/>
+          <w:szCs w:val="20"/>
+        </w:rPr>
+        <w:t xml:space="preserve">実際に動く時刻は数分ずれます。7:00 に設定しても 7:03 に動くことがあります。ぴったりの時刻を前提にしないでください。</w:t>
+      </w:r>
+    </w:p>
+    <w:p>
+      <w:pPr>
+        <w:pStyle w:val="Heading2"/>
+        <w:spacing w:after="80" w:before="280"/>
+      </w:pPr>
+      <w:r>
+        <w:rPr>
+          <w:rFonts w:ascii="Yu Gothic" w:cs="Yu Gothic" w:eastAsia="Yu Gothic" w:hAnsi="Yu Gothic"/>
+          <w:b/>
+          <w:bCs/>
+          <w:sz w:val="24"/>
+          <w:szCs w:val="24"/>
+        </w:rPr>
+        <w:t xml:space="preserve">手順15　時刻を待たずに今すぐ動かす</w:t>
+      </w:r>
+    </w:p>
+    <w:tbl>
+      <w:tblPr>
+        <w:tblW w:type="dxa" w:w="9638"/>
+        <w:tblBorders>
+          <w:top w:val="single" w:color="auto" w:sz="4"/>
+          <w:left w:val="single" w:color="auto" w:sz="4"/>
+          <w:bottom w:val="single" w:color="auto" w:sz="4"/>
+          <w:right w:val="single" w:color="auto" w:sz="4"/>
+          <w:insideH w:val="single" w:color="auto" w:sz="4"/>
+          <w:insideV w:val="single" w:color="auto" w:sz="4"/>
+        </w:tblBorders>
+      </w:tblPr>
+      <w:tblGrid>
+        <w:gridCol w:w="1500"/>
+        <w:gridCol w:w="8138"/>
+      </w:tblGrid>
+      <w:tr>
+        <w:trPr>
+          <w:tblHeader w:val="false"/>
+        </w:trPr>
+        <w:tc>
+          <w:tcPr>
+            <w:tcW w:type="dxa" w:w="1500"/>
+            <w:tcMar>
+              <w:top w:type="dxa" w:w="60"/>
+              <w:left w:type="dxa" w:w="100"/>
+              <w:bottom w:type="dxa" w:w="60"/>
+              <w:right w:type="dxa" w:w="100"/>
+            </w:tcMar>
+          </w:tcPr>
+          <w:p>
+            <w:pPr>
+              <w:spacing w:after="0" w:line="280"/>
+            </w:pPr>
+            <w:r>
+              <w:rPr>
+                <w:rFonts w:ascii="Yu Gothic" w:cs="Yu Gothic" w:eastAsia="Yu Gothic" w:hAnsi="Yu Gothic"/>
+                <w:sz w:val="19"/>
+                <w:szCs w:val="19"/>
+              </w:rPr>
+              <w:t xml:space="preserve">いつ</w:t>
+            </w:r>
+          </w:p>
+        </w:tc>
+        <w:tc>
+          <w:tcPr>
+            <w:tcW w:type="dxa" w:w="8138"/>
+            <w:tcMar>
+              <w:top w:type="dxa" w:w="60"/>
+              <w:left w:type="dxa" w:w="100"/>
+              <w:bottom w:type="dxa" w:w="60"/>
+              <w:right w:type="dxa" w:w="100"/>
+            </w:tcMar>
+          </w:tcPr>
+          <w:p>
+            <w:pPr>
+              <w:spacing w:after="0" w:line="280"/>
+            </w:pPr>
+            <w:r>
+              <w:rPr>
+                <w:rFonts w:ascii="Yu Gothic" w:cs="Yu Gothic" w:eastAsia="Yu Gothic" w:hAnsi="Yu Gothic"/>
+                <w:sz w:val="19"/>
+                <w:szCs w:val="19"/>
+              </w:rPr>
+              <w:t xml:space="preserve">先に結果が見たいとき／設定していないものを1回だけ回したいとき</w:t>
+            </w:r>
+          </w:p>
+        </w:tc>
+      </w:tr>
+      <w:tr>
+        <w:trPr>
+          <w:tblHeader w:val="false"/>
+        </w:trPr>
+        <w:tc>
+          <w:tcPr>
+            <w:tcW w:type="dxa" w:w="1500"/>
+            <w:tcMar>
+              <w:top w:type="dxa" w:w="60"/>
+              <w:left w:type="dxa" w:w="100"/>
+              <w:bottom w:type="dxa" w:w="60"/>
+              <w:right w:type="dxa" w:w="100"/>
+            </w:tcMar>
+          </w:tcPr>
+          <w:p>
+            <w:pPr>
+              <w:spacing w:after="0" w:line="280"/>
+            </w:pPr>
+            <w:r>
+              <w:rPr>
+                <w:rFonts w:ascii="Yu Gothic" w:cs="Yu Gothic" w:eastAsia="Yu Gothic" w:hAnsi="Yu Gothic"/>
+                <w:sz w:val="19"/>
+                <w:szCs w:val="19"/>
+              </w:rPr>
+              <w:t xml:space="preserve">誰が</w:t>
+            </w:r>
+          </w:p>
+        </w:tc>
+        <w:tc>
+          <w:tcPr>
+            <w:tcW w:type="dxa" w:w="8138"/>
+            <w:tcMar>
+              <w:top w:type="dxa" w:w="60"/>
+              <w:left w:type="dxa" w:w="100"/>
+              <w:bottom w:type="dxa" w:w="60"/>
+              <w:right w:type="dxa" w:w="100"/>
+            </w:tcMar>
+          </w:tcPr>
+          <w:p>
+            <w:pPr>
+              <w:spacing w:after="0" w:line="280"/>
+            </w:pPr>
+            <w:r>
+              <w:rPr>
+                <w:rFonts w:ascii="Yu Gothic" w:cs="Yu Gothic" w:eastAsia="Yu Gothic" w:hAnsi="Yu Gothic"/>
+                <w:sz w:val="19"/>
+                <w:szCs w:val="19"/>
+              </w:rPr>
+              <w:t xml:space="preserve">経理担当</w:t>
+            </w:r>
+          </w:p>
+        </w:tc>
+      </w:tr>
+      <w:tr>
+        <w:trPr>
+          <w:tblHeader w:val="false"/>
+        </w:trPr>
+        <w:tc>
+          <w:tcPr>
+            <w:tcW w:type="dxa" w:w="1500"/>
+            <w:tcMar>
+              <w:top w:type="dxa" w:w="60"/>
+              <w:left w:type="dxa" w:w="100"/>
+              <w:bottom w:type="dxa" w:w="60"/>
+              <w:right w:type="dxa" w:w="100"/>
+            </w:tcMar>
+          </w:tcPr>
+          <w:p>
+            <w:pPr>
+              <w:spacing w:after="0" w:line="280"/>
+            </w:pPr>
+            <w:r>
+              <w:rPr>
+                <w:rFonts w:ascii="Yu Gothic" w:cs="Yu Gothic" w:eastAsia="Yu Gothic" w:hAnsi="Yu Gothic"/>
+                <w:sz w:val="19"/>
+                <w:szCs w:val="19"/>
+              </w:rPr>
+              <w:t xml:space="preserve">所要</w:t>
+            </w:r>
+          </w:p>
+        </w:tc>
+        <w:tc>
+          <w:tcPr>
+            <w:tcW w:type="dxa" w:w="8138"/>
+            <w:tcMar>
+              <w:top w:type="dxa" w:w="60"/>
+              <w:left w:type="dxa" w:w="100"/>
+              <w:bottom w:type="dxa" w:w="60"/>
+              <w:right w:type="dxa" w:w="100"/>
+            </w:tcMar>
+          </w:tcPr>
+          <w:p>
+            <w:pPr>
+              <w:spacing w:after="0" w:line="280"/>
+            </w:pPr>
+            <w:r>
+              <w:rPr>
+                <w:rFonts w:ascii="Yu Gothic" w:cs="Yu Gothic" w:eastAsia="Yu Gothic" w:hAnsi="Yu Gothic"/>
+                <w:sz w:val="19"/>
+                <w:szCs w:val="19"/>
+              </w:rPr>
+              <w:t xml:space="preserve">1分</w:t>
+            </w:r>
+          </w:p>
+        </w:tc>
+      </w:tr>
+    </w:tbl>
+    <w:p>
+      <w:pPr>
+        <w:spacing w:after="100"/>
+      </w:pPr>
+    </w:p>
+    <w:p>
+      <w:pPr>
+        <w:spacing w:after="60" w:line="300"/>
+        <w:ind w:left="340" w:hanging="340"/>
+      </w:pPr>
+      <w:r>
+        <w:rPr>
+          <w:rFonts w:ascii="Yu Gothic" w:cs="Yu Gothic" w:eastAsia="Yu Gothic" w:hAnsi="Yu Gothic"/>
+          <w:b/>
+          <w:bCs/>
+          <w:sz w:val="21"/>
+          <w:szCs w:val="21"/>
+        </w:rPr>
+        <w:t xml:space="preserve">1．</w:t>
+      </w:r>
+      <w:r>
+        <w:rPr>
+          <w:rFonts w:ascii="Yu Gothic" w:cs="Yu Gothic" w:eastAsia="Yu Gothic" w:hAnsi="Yu Gothic"/>
+          <w:sz w:val="21"/>
+          <w:szCs w:val="21"/>
+        </w:rPr>
+        <w:t xml:space="preserve">「⏰ 自動実行」を開く</w:t>
+      </w:r>
+    </w:p>
+    <w:p>
+      <w:pPr>
+        <w:spacing w:after="60" w:line="300"/>
+        <w:ind w:left="340" w:hanging="340"/>
+      </w:pPr>
+      <w:r>
+        <w:rPr>
+          <w:rFonts w:ascii="Yu Gothic" w:cs="Yu Gothic" w:eastAsia="Yu Gothic" w:hAnsi="Yu Gothic"/>
+          <w:b/>
+          <w:bCs/>
+          <w:sz w:val="21"/>
+          <w:szCs w:val="21"/>
+        </w:rPr>
+        <w:t xml:space="preserve">2．</w:t>
+      </w:r>
+      <w:r>
+        <w:rPr>
+          <w:rFonts w:ascii="Yu Gothic" w:cs="Yu Gothic" w:eastAsia="Yu Gothic" w:hAnsi="Yu Gothic"/>
+          <w:sz w:val="21"/>
+          <w:szCs w:val="21"/>
+        </w:rPr>
+        <w:t xml:space="preserve">動かしたい行の「▶ 今すぐ」を押す</w:t>
+      </w:r>
+    </w:p>
+    <w:p>
+      <w:pPr>
+        <w:spacing w:after="60" w:line="300"/>
+        <w:ind w:left="340" w:hanging="340"/>
+      </w:pPr>
+      <w:r>
+        <w:rPr>
+          <w:rFonts w:ascii="Yu Gothic" w:cs="Yu Gothic" w:eastAsia="Yu Gothic" w:hAnsi="Yu Gothic"/>
+          <w:b/>
+          <w:bCs/>
+          <w:sz w:val="21"/>
+          <w:szCs w:val="21"/>
+        </w:rPr>
+        <w:t xml:space="preserve">3．</w:t>
+      </w:r>
+      <w:r>
+        <w:rPr>
+          <w:rFonts w:ascii="Yu Gothic" w:cs="Yu Gothic" w:eastAsia="Yu Gothic" w:hAnsi="Yu Gothic"/>
+          <w:sz w:val="21"/>
+          <w:szCs w:val="21"/>
+        </w:rPr>
+        <w:t xml:space="preserve">Cowork が開くので、内容を確認して送信する</w:t>
+      </w:r>
+    </w:p>
+    <w:p>
+      <w:pPr>
+        <w:spacing w:after="100"/>
+      </w:pPr>
+    </w:p>
+    <w:p>
+      <w:pPr>
+        <w:spacing w:after="120" w:line="300"/>
+      </w:pPr>
+      <w:r>
+        <w:rPr>
+          <w:rFonts w:ascii="Yu Gothic" w:cs="Yu Gothic" w:eastAsia="Yu Gothic" w:hAnsi="Yu Gothic"/>
+          <w:sz w:val="21"/>
+          <w:szCs w:val="21"/>
+        </w:rPr>
+        <w:t xml:space="preserve">チェックを外している行でも押せます。自動実行に乗せていない作業を、必要なときだけ手で回す使い方ができます。</w:t>
+      </w:r>
+    </w:p>
+    <w:p>
+      <w:pPr>
+        <w:pBdr>
+          <w:left w:val="single" w:color="BFBFBF" w:sz="12" w:space="8"/>
+        </w:pBdr>
+        <w:spacing w:after="140" w:before="80" w:line="300"/>
+        <w:ind w:left="200"/>
+      </w:pPr>
+      <w:r>
+        <w:rPr>
+          <w:rFonts w:ascii="Yu Gothic" w:cs="Yu Gothic" w:eastAsia="Yu Gothic" w:hAnsi="Yu Gothic"/>
+          <w:color w:val="404040"/>
+          <w:sz w:val="20"/>
+          <w:szCs w:val="20"/>
+        </w:rPr>
+        <w:t xml:space="preserve">「▶ 今すぐ」はその作業を1回やらせるボタンで、設定した時刻や内容は変わりません。なお、ここで与えた許可は自動実行には引き継がれません（許可は自動実行の側に別に記録されます）。</w:t>
+      </w:r>
+    </w:p>
+    <w:p>
+      <w:pPr>
+        <w:pStyle w:val="Heading1"/>
+        <w:pageBreakBefore/>
+        <w:spacing w:after="140" w:before="0"/>
+      </w:pPr>
+      <w:r>
+        <w:rPr>
+          <w:rFonts w:ascii="Yu Gothic" w:cs="Yu Gothic" w:eastAsia="Yu Gothic" w:hAnsi="Yu Gothic"/>
+          <w:b/>
+          <w:bCs/>
+          <w:sz w:val="28"/>
+          <w:szCs w:val="28"/>
+        </w:rPr>
+        <w:t xml:space="preserve">5. 要確認事項に出た項目の対処</w:t>
       </w:r>
     </w:p>
     <w:p>
@@ -7958,14 +9898,10 @@
       </w:tr>
     </w:tbl>
     <w:p>
-      <w:r>
-        <w:br w:type="page"/>
-      </w:r>
-    </w:p>
-    <w:p>
       <w:pPr>
         <w:pStyle w:val="Heading1"/>
-        <w:spacing w:after="140" w:before="320"/>
+        <w:pageBreakBefore/>
+        <w:spacing w:after="140" w:before="0"/>
       </w:pPr>
       <w:r>
         <w:rPr>
@@ -7975,7 +9911,7 @@
           <w:sz w:val="28"/>
           <w:szCs w:val="28"/>
         </w:rPr>
-        <w:t xml:space="preserve">5. 困ったとき</w:t>
+        <w:t xml:space="preserve">6. 困ったとき</w:t>
       </w:r>
     </w:p>
     <w:p>
@@ -8231,7 +10167,7 @@
           <w:sz w:val="28"/>
           <w:szCs w:val="28"/>
         </w:rPr>
-        <w:t xml:space="preserve">6. やってはいけないこと</w:t>
+        <w:t xml:space="preserve">7. やってはいけないこと</w:t>
       </w:r>
     </w:p>
     <w:tbl>
@@ -8694,7 +10630,7 @@
           <w:sz w:val="28"/>
           <w:szCs w:val="28"/>
         </w:rPr>
-        <w:t xml:space="preserve">7. 何が正本か（迷ったとき）</w:t>
+        <w:t xml:space="preserve">8. 何が正本か（迷ったとき）</w:t>
       </w:r>
     </w:p>
     <w:tbl>

</xml_diff>

<commit_message>
publish: sync from 正本 2026-08-17T16:20:41Z
</commit_message>
<xml_diff>
--- a/plugins/osi-finance/docs/OSI-Finance-運用手順書.docx
+++ b/plugins/osi-finance/docs/OSI-Finance-運用手順書.docx
@@ -7887,7 +7887,7 @@
                 <w:sz w:val="19"/>
                 <w:szCs w:val="19"/>
               </w:rPr>
-              <w:t xml:space="preserve">表の内容どおりに直す。チェックを外したものは自動実行から外れる</w:t>
+              <w:t xml:space="preserve">表の内容どおりに直す。チェックを外したものは削除される</w:t>
             </w:r>
           </w:p>
         </w:tc>
@@ -7993,7 +7993,7 @@
                 <w:sz w:val="19"/>
                 <w:szCs w:val="19"/>
               </w:rPr>
-              <w:t xml:space="preserve">7本すべてを自動実行から外す。手動の「▶ 今すぐ」は使える</w:t>
+              <w:t xml:space="preserve">7本すべてを削除する。定義は残るので再登録できる</w:t>
             </w:r>
           </w:p>
         </w:tc>
@@ -8067,7 +8067,7 @@
           <w:sz w:val="20"/>
           <w:szCs w:val="20"/>
         </w:rPr>
-        <w:t xml:space="preserve">設定した直後に「▶ 今すぐ」を1回押してください。初回はメールなどへのアクセス許可を聞かれます。先に通しておかないと、朝の自動実行が許可待ちで止まり、報告が来ません。</w:t>
+        <w:t xml:space="preserve">設定した直後に「▶ 今すぐ」を1回押してください。初回はメールなどへのアクセス許可を聞かれます。先に通しておかないと、朝の自動実行が許可待ちで止まり、報告が来ません。なお、削除すると、そのタスクに覚えさせたアクセス許可も消えます。消したものを戻したときは、必ず「▶ 今すぐ」を1回押して許可を通し直してください。押さないと、翌朝の自動実行が許可待ちで止まり、報告が来ません。</w:t>
       </w:r>
     </w:p>
     <w:p>

</xml_diff>

<commit_message>
publish: sync from 正本 2026-08-18T01:47:38Z
</commit_message>
<xml_diff>
--- a/plugins/osi-finance/docs/OSI-Finance-運用手順書.docx
+++ b/plugins/osi-finance/docs/OSI-Finance-運用手順書.docx
@@ -218,7 +218,7 @@
           <w:sz w:val="21"/>
           <w:szCs w:val="21"/>
         </w:rPr>
-        <w:t xml:space="preserve">⚠ この7本は、最初は動いていません。</w:t>
+        <w:t xml:space="preserve">⚠ この6本は、最初は動いていません。</w:t>
       </w:r>
       <w:r>
         <w:rPr>
@@ -387,7 +387,7 @@
                 <w:sz w:val="19"/>
                 <w:szCs w:val="19"/>
               </w:rPr>
-              <w:t xml:space="preserve">毎朝 7:00</w:t>
+              <w:t xml:space="preserve">（廃止）</w:t>
             </w:r>
           </w:p>
         </w:tc>
@@ -411,7 +411,7 @@
                 <w:sz w:val="19"/>
                 <w:szCs w:val="19"/>
               </w:rPr>
-              <w:t xml:space="preserve">請求書を送ったかメールで確認して、台帳のステータスとの差を報告</w:t>
+              <w:t xml:space="preserve">2026-08-18 に廃止しました。請求書SaaS のフラグが今の運用では立たず、毎朝ノイズが出るだけだったためです</w:t>
             </w:r>
           </w:p>
         </w:tc>
@@ -435,7 +435,7 @@
                 <w:sz w:val="19"/>
                 <w:szCs w:val="19"/>
               </w:rPr>
-              <w:t xml:space="preserve">差があれば画面で状態を直す</w:t>
+              <w:t xml:space="preserve">（この行は廃止済みの記録です）</w:t>
             </w:r>
           </w:p>
         </w:tc>
@@ -7339,7 +7339,7 @@
           <w:sz w:val="21"/>
           <w:szCs w:val="21"/>
         </w:rPr>
-        <w:t xml:space="preserve">サイドバーの「⏰ 自動実行」を開きます。ここは、上の7本を「いつ走らせるか」決める画面です。</w:t>
+        <w:t xml:space="preserve">サイドバーの「⏰ 自動実行」を開きます。ここは、上の6本を「いつ走らせるか」決める画面です。</w:t>
       </w:r>
     </w:p>
     <w:p>
@@ -7993,7 +7993,7 @@
                 <w:sz w:val="19"/>
                 <w:szCs w:val="19"/>
               </w:rPr>
-              <w:t xml:space="preserve">7本すべてを削除する。定義は残るので再登録できる</w:t>
+              <w:t xml:space="preserve">6本すべてを削除する。定義は残るので再登録できる</w:t>
             </w:r>
           </w:p>
         </w:tc>

</xml_diff>